<commit_message>
docs: update application organization
</commit_message>
<xml_diff>
--- a/Organización de la aplicación.docx
+++ b/Organización de la aplicación.docx
@@ -3232,51 +3232,32 @@
           <w:tab w:val="left" w:pos="1572"/>
         </w:tabs>
       </w:pPr>
-      <w:proofErr w:type="spellStart"/>
-      <w:r>
-        <w:t>npm</w:t>
-      </w:r>
-      <w:proofErr w:type="spellEnd"/>
-      <w:r>
-        <w:t xml:space="preserve"> </w:t>
-      </w:r>
-      <w:proofErr w:type="spellStart"/>
-      <w:r>
-        <w:t>install</w:t>
-      </w:r>
-      <w:proofErr w:type="spellEnd"/>
-      <w:r>
-        <w:t xml:space="preserve"> --</w:t>
-      </w:r>
-      <w:proofErr w:type="spellStart"/>
-      <w:r>
-        <w:t>save-dev</w:t>
-      </w:r>
-      <w:proofErr w:type="spellEnd"/>
-      <w:r>
-        <w:t xml:space="preserve"> </w:t>
-      </w:r>
-      <w:proofErr w:type="spellStart"/>
-      <w:r>
-        <w:t>jest</w:t>
-      </w:r>
-      <w:proofErr w:type="spellEnd"/>
-      <w:r>
-        <w:t xml:space="preserve"> @testing-library/react-native @testing-library/jest-native </w:t>
-      </w:r>
-      <w:proofErr w:type="spellStart"/>
-      <w:r>
-        <w:t>react</w:t>
-      </w:r>
-      <w:proofErr w:type="spellEnd"/>
-      <w:r>
-        <w:t>-test-</w:t>
-      </w:r>
-      <w:proofErr w:type="spellStart"/>
-      <w:r>
-        <w:t>renderer</w:t>
-      </w:r>
-      <w:proofErr w:type="spellEnd"/>
+      <w:r>
+        <w:t>npm install --save-dev jest @testing-library/react-native @testing-library/jest-native react-test-renderer</w:t>
+      </w:r>
+    </w:p>
+    <w:p>
+      <w:pPr>
+        <w:tabs>
+          <w:tab w:val="left" w:pos="1572"/>
+        </w:tabs>
+      </w:pPr>
+    </w:p>
+    <w:p>
+      <w:pPr>
+        <w:tabs>
+          <w:tab w:val="left" w:pos="1572"/>
+        </w:tabs>
+      </w:pPr>
+      <w:r>
+        <w:t xml:space="preserve">desplegamos el back con Docker </w:t>
+      </w:r>
+      <w:r>
+        <w:br/>
+      </w:r>
+      <w:r>
+        <w:t>para el frontend desplegamos en vercel</w:t>
+      </w:r>
     </w:p>
     <w:sectPr>
       <w:pgSz w:w="11906" w:h="16838"/>

</xml_diff>